<commit_message>
updated vacate stay docx
</commit_message>
<xml_diff>
--- a/templates/telangana/high_court/vacate_in_WP.docx
+++ b/templates/telangana/high_court/vacate_in_WP.docx
@@ -18,7 +18,7 @@
           <w:sz w:val="28"/>
           <w:szCs w:val="28"/>
         </w:rPr>
-        <w:t>{{COURT_NAME}}</w:t>
+        <w:t>{{court_name}}</w:t>
       </w:r>
     </w:p>
     <w:p>
@@ -1958,7 +1958,27 @@
           <w:szCs w:val="28"/>
         </w:rPr>
         <w:lastRenderedPageBreak/>
-        <w:t>HIGH COURT</w:t>
+        <w:t>{{</w:t>
+      </w:r>
+      <w:proofErr w:type="spellStart"/>
+      <w:r>
+        <w:rPr>
+          <w:b/>
+          <w:bCs/>
+          <w:sz w:val="28"/>
+          <w:szCs w:val="28"/>
+        </w:rPr>
+        <w:t>court_name</w:t>
+      </w:r>
+      <w:proofErr w:type="spellEnd"/>
+      <w:r>
+        <w:rPr>
+          <w:b/>
+          <w:bCs/>
+          <w:sz w:val="28"/>
+          <w:szCs w:val="28"/>
+        </w:rPr>
+        <w:t>}}</w:t>
       </w:r>
     </w:p>
     <w:p>

</xml_diff>